<commit_message>
chore: l'assistant s'appelle désormais « Jupiter IA » (interface, API, documentation, manuels)
Co-Authored-By: Claude Opus 5.5 <noreply@anthropic.com>
Claude-Session: https://claude.ai/code/session_01PES9v2QUtNkt2rhV2e9a8j
</commit_message>
<xml_diff>
--- a/docs/manuels/word/01_MANUEL_DE_PRESENTATION.docx
+++ b/docs/manuels/word/01_MANUEL_DE_PRESENTATION.docx
@@ -214,7 +214,7 @@
         <w:pStyle w:val="Compact"/>
       </w:pPr>
       <w:r>
-        <w:t xml:space="preserve">JUPSER IA : l’assistant qui propose, l’humain qui valide</w:t>
+        <w:t xml:space="preserve">Jupiter IA : l’assistant qui propose, l’humain qui valide</w:t>
       </w:r>
     </w:p>
     <w:p>
@@ -2863,13 +2863,13 @@
       </w:r>
     </w:p>
     <w:bookmarkEnd w:id="39"/>
-    <w:bookmarkStart w:id="40" w:name="X4cc47cc0a788a3ad6c4856275e6f260f3ead619"/>
+    <w:bookmarkStart w:id="40" w:name="X9e9b4627e44152f747cf6c7d41cec795432a7ba"/>
     <w:p>
       <w:pPr>
         <w:pStyle w:val="Heading2"/>
       </w:pPr>
       <w:r>
-        <w:t xml:space="preserve">12. JUPSER IA : l’assistant qui propose, l’humain qui valide</w:t>
+        <w:t xml:space="preserve">12. Jupiter IA : l’assistant qui propose, l’humain qui valide</w:t>
       </w:r>
     </w:p>
     <w:p>

</xml_diff>